<commit_message>
Add placeholders to partial exam template
Co-authored-by: kaymax239 <kaymax239@users.noreply.github.com>
</commit_message>
<xml_diff>
--- a/planeaciones-nautica/public/templates/examen-parcial.docx
+++ b/planeaciones-nautica/public/templates/examen-parcial.docx
@@ -1,8 +1,8 @@
 
 <file path=word/document.xml><?xml version="1.0" encoding="utf-8"?>
-<w:document xmlns:wpc="http://schemas.microsoft.com/office/word/2010/wordprocessingCanvas" xmlns:cx="http://schemas.microsoft.com/office/drawing/2014/chartex" xmlns:cx1="http://schemas.microsoft.com/office/drawing/2015/9/8/chartex" xmlns:cx2="http://schemas.microsoft.com/office/drawing/2015/10/21/chartex" xmlns:cx3="http://schemas.microsoft.com/office/drawing/2016/5/9/chartex" xmlns:cx4="http://schemas.microsoft.com/office/drawing/2016/5/10/chartex" xmlns:cx5="http://schemas.microsoft.com/office/drawing/2016/5/11/chartex" xmlns:cx6="http://schemas.microsoft.com/office/drawing/2016/5/12/chartex" xmlns:cx7="http://schemas.microsoft.com/office/drawing/2016/5/13/chartex" xmlns:cx8="http://schemas.microsoft.com/office/drawing/2016/5/14/chartex" xmlns:mc="http://schemas.openxmlformats.org/markup-compatibility/2006" xmlns:aink="http://schemas.microsoft.com/office/drawing/2016/ink" xmlns:am3d="http://schemas.microsoft.com/office/drawing/2017/model3d" xmlns:o="urn:schemas-microsoft-com:office:office" xmlns:oel="http://schemas.microsoft.com/office/2019/extlst" xmlns:r="http://schemas.openxmlformats.org/officeDocument/2006/relationships" xmlns:m="http://schemas.openxmlformats.org/officeDocument/2006/math" xmlns:v="urn:schemas-microsoft-com:vml" xmlns:wp14="http://schemas.microsoft.com/office/word/2010/wordprocessingDrawing" xmlns:wp="http://schemas.openxmlformats.org/drawingml/2006/wordprocessingDrawing" xmlns:w10="urn:schemas-microsoft-com:office:word" xmlns:w="http://schemas.openxmlformats.org/wordprocessingml/2006/main" xmlns:w14="http://schemas.microsoft.com/office/word/2010/wordml" xmlns:w15="http://schemas.microsoft.com/office/word/2012/wordml" xmlns:w16cex="http://schemas.microsoft.com/office/word/2018/wordml/cex" xmlns:w16cid="http://schemas.microsoft.com/office/word/2016/wordml/cid" xmlns:w16="http://schemas.microsoft.com/office/word/2018/wordml" xmlns:w16du="http://schemas.microsoft.com/office/word/2023/wordml/word16du" xmlns:w16sdtdh="http://schemas.microsoft.com/office/word/2020/wordml/sdtdatahash" xmlns:w16sdtfl="http://schemas.microsoft.com/office/word/2024/wordml/sdtformatlock" xmlns:w16se="http://schemas.microsoft.com/office/word/2015/wordml/symex" xmlns:wpg="http://schemas.microsoft.com/office/word/2010/wordprocessingGroup" xmlns:wpi="http://schemas.microsoft.com/office/word/2010/wordprocessingInk" xmlns:wne="http://schemas.microsoft.com/office/word/2006/wordml" xmlns:wps="http://schemas.microsoft.com/office/word/2010/wordprocessingShape" mc:Ignorable="w14 w15 w16se w16cid w16 w16cex w16sdtdh w16sdtfl w16du wp14">
+<w:document xmlns:ns1="http://schemas.openxmlformats.org/markup-compatibility/2006" xmlns:ns2="http://schemas.microsoft.com/office/word/2010/wordml" xmlns:ns3="http://schemas.openxmlformats.org/drawingml/2006/wordprocessingDrawing" xmlns:ns4="http://schemas.microsoft.com/office/word/2010/wordprocessingDrawing" xmlns:ns5="http://schemas.openxmlformats.org/drawingml/2006/main" xmlns:ns6="http://schemas.openxmlformats.org/drawingml/2006/picture" xmlns:ns7="http://schemas.openxmlformats.org/officeDocument/2006/relationships" xmlns:w="http://schemas.openxmlformats.org/wordprocessingml/2006/main" ns1:Ignorable="w14 w15 w16se w16cid w16 w16cex w16sdtdh w16sdtfl w16du wp14">
   <w:body>
-    <w:p>
+    <w:p ns2:paraId="185D044C" ns2:textId="77777777">
       <w:pPr>
         <w:widowControl w:val="0"/>
         <w:pBdr>
@@ -30,7 +30,7 @@
       <w:tblGrid>
         <w:gridCol w:w="10466"/>
       </w:tblGrid>
-      <w:tr>
+      <w:tr ns2:paraId="558613BF" ns2:textId="77777777">
         <w:trPr>
           <w:trHeight w:val="1418"/>
         </w:trPr>
@@ -38,7 +38,7 @@
           <w:tcPr>
             <w:tcW w:w="10466" w:type="dxa"/>
           </w:tcPr>
-          <w:p>
+          <w:p ns2:paraId="437A882A" ns2:textId="77777777">
             <w:pPr>
               <w:widowControl w:val="0"/>
               <w:pBdr>
@@ -75,7 +75,7 @@
               <w:gridCol w:w="4820"/>
               <w:gridCol w:w="5387"/>
             </w:tblGrid>
-            <w:tr>
+            <w:tr ns2:paraId="6B52AF05" ns2:textId="77777777">
               <w:trPr>
                 <w:trHeight w:val="983"/>
               </w:trPr>
@@ -83,7 +83,7 @@
                 <w:tcPr>
                   <w:tcW w:w="4820" w:type="dxa"/>
                 </w:tcPr>
-                <w:p>
+                <w:p ns2:paraId="4EC681B5" ns2:textId="77777777">
                   <w:pPr>
                     <w:pBdr>
                       <w:top w:val="nil"/>
@@ -108,47 +108,47 @@
                       <w:noProof/>
                     </w:rPr>
                     <w:drawing>
-                      <wp:anchor distT="0" distB="0" distL="0" distR="0" simplePos="0" relativeHeight="251658240" behindDoc="1" locked="0" layoutInCell="1" hidden="0" allowOverlap="1" wp14:anchorId="4F5352ED" wp14:editId="4AA13952">
-                        <wp:simplePos x="0" y="0"/>
-                        <wp:positionH relativeFrom="column">
-                          <wp:posOffset>-93979</wp:posOffset>
-                        </wp:positionH>
-                        <wp:positionV relativeFrom="paragraph">
-                          <wp:posOffset>-8254</wp:posOffset>
-                        </wp:positionV>
-                        <wp:extent cx="2609850" cy="628650"/>
-                        <wp:effectExtent l="0" t="0" r="0" b="0"/>
-                        <wp:wrapNone/>
-                        <wp:docPr id="1" name="image1.png"/>
-                        <wp:cNvGraphicFramePr/>
-                        <a:graphic xmlns:a="http://schemas.openxmlformats.org/drawingml/2006/main">
-                          <a:graphicData uri="http://schemas.openxmlformats.org/drawingml/2006/picture">
-                            <pic:pic xmlns:pic="http://schemas.openxmlformats.org/drawingml/2006/picture">
-                              <pic:nvPicPr>
-                                <pic:cNvPr id="0" name="image1.png"/>
-                                <pic:cNvPicPr preferRelativeResize="0"/>
-                              </pic:nvPicPr>
-                              <pic:blipFill>
-                                <a:blip r:embed="rId6"/>
-                                <a:srcRect l="7840" t="6125" r="51767" b="86902"/>
-                                <a:stretch>
-                                  <a:fillRect/>
-                                </a:stretch>
-                              </pic:blipFill>
-                              <pic:spPr>
-                                <a:xfrm>
-                                  <a:off x="0" y="0"/>
-                                  <a:ext cx="2609850" cy="628650"/>
-                                </a:xfrm>
-                                <a:prstGeom prst="rect">
-                                  <a:avLst/>
-                                </a:prstGeom>
-                                <a:ln/>
-                              </pic:spPr>
-                            </pic:pic>
-                          </a:graphicData>
-                        </a:graphic>
-                      </wp:anchor>
+                      <ns3:anchor distT="0" distB="0" distL="0" distR="0" simplePos="0" relativeHeight="251658240" behindDoc="1" locked="0" layoutInCell="1" hidden="0" allowOverlap="1" ns4:anchorId="4F5352ED" ns4:editId="4AA13952">
+                        <ns3:simplePos x="0" y="0"/>
+                        <ns3:positionH relativeFrom="column">
+                          <ns3:posOffset>-93979</ns3:posOffset>
+                        </ns3:positionH>
+                        <ns3:positionV relativeFrom="paragraph">
+                          <ns3:posOffset>-8254</ns3:posOffset>
+                        </ns3:positionV>
+                        <ns3:extent cx="2609850" cy="628650"/>
+                        <ns3:effectExtent l="0" t="0" r="0" b="0"/>
+                        <ns3:wrapNone/>
+                        <ns3:docPr id="1" name="image1.png"/>
+                        <ns3:cNvGraphicFramePr/>
+                        <ns5:graphic>
+                          <ns5:graphicData uri="http://schemas.openxmlformats.org/drawingml/2006/picture">
+                            <ns6:pic>
+                              <ns6:nvPicPr>
+                                <ns6:cNvPr id="0" name="image1.png"/>
+                                <ns6:cNvPicPr preferRelativeResize="0"/>
+                              </ns6:nvPicPr>
+                              <ns6:blipFill>
+                                <ns5:blip ns7:embed="rId6"/>
+                                <ns5:srcRect l="7840" t="6125" r="51767" b="86902"/>
+                                <ns5:stretch>
+                                  <ns5:fillRect/>
+                                </ns5:stretch>
+                              </ns6:blipFill>
+                              <ns6:spPr>
+                                <ns5:xfrm>
+                                  <ns5:off x="0" y="0"/>
+                                  <ns5:ext cx="2609850" cy="628650"/>
+                                </ns5:xfrm>
+                                <ns5:prstGeom prst="rect">
+                                  <ns5:avLst/>
+                                </ns5:prstGeom>
+                                <ns5:ln/>
+                              </ns6:spPr>
+                            </ns6:pic>
+                          </ns5:graphicData>
+                        </ns5:graphic>
+                      </ns3:anchor>
                     </w:drawing>
                   </w:r>
                 </w:p>
@@ -157,7 +157,7 @@
                 <w:tcPr>
                   <w:tcW w:w="5387" w:type="dxa"/>
                 </w:tcPr>
-                <w:p>
+                <w:p ns2:paraId="306ADD6A" ns2:textId="77777777">
                   <w:pPr>
                     <w:pBdr>
                       <w:top w:val="nil"/>
@@ -178,7 +178,7 @@
                     </w:rPr>
                   </w:pPr>
                 </w:p>
-                <w:p>
+                <w:p ns2:paraId="0EBCEB20" ns2:textId="77777777">
                   <w:pPr>
                     <w:pBdr>
                       <w:top w:val="nil"/>
@@ -210,7 +210,7 @@
                     <w:t>ESCUELA NAUTICA MERCANTE DE TAMPICO</w:t>
                   </w:r>
                 </w:p>
-                <w:p>
+                <w:p ns2:paraId="0094E646" ns2:textId="77777777">
                   <w:pPr>
                     <w:pBdr>
                       <w:top w:val="nil"/>
@@ -245,7 +245,7 @@
               </w:tc>
             </w:tr>
           </w:tbl>
-          <w:p>
+          <w:p ns2:paraId="5E11375F" ns2:textId="77777777">
             <w:pPr>
               <w:pBdr>
                 <w:top w:val="nil"/>
@@ -268,7 +268,7 @@
           </w:p>
         </w:tc>
       </w:tr>
-      <w:tr>
+      <w:tr ns2:paraId="36400BB7" ns2:textId="77777777">
         <w:trPr>
           <w:trHeight w:val="938"/>
         </w:trPr>
@@ -276,7 +276,7 @@
           <w:tcPr>
             <w:tcW w:w="10466" w:type="dxa"/>
           </w:tcPr>
-          <w:p>
+          <w:p ns2:paraId="13B0773B" ns2:textId="5928956A">
             <w:pPr>
               <w:pBdr>
                 <w:top w:val="nil"/>
@@ -334,7 +334,7 @@
               <w:t xml:space="preserve"> PARCIAL</w:t>
             </w:r>
           </w:p>
-          <w:p>
+          <w:p ns2:paraId="73DADB09" ns2:textId="77777777">
             <w:pPr>
               <w:pBdr>
                 <w:top w:val="nil"/>
@@ -368,7 +368,7 @@
               <w:t xml:space="preserve"> </w:t>
             </w:r>
           </w:p>
-          <w:p>
+          <w:p ns2:paraId="2E11E8D9" ns2:textId="45AABFA3">
             <w:pPr>
               <w:pBdr>
                 <w:top w:val="nil"/>
@@ -396,7 +396,7 @@
               <w:t xml:space="preserve">ASIGNATURA: </w:t>
             </w:r>
           </w:p>
-          <w:p>
+          <w:p ns2:paraId="5EB73E4E" ns2:textId="77777777">
             <w:pPr>
               <w:pBdr>
                 <w:top w:val="nil"/>
@@ -415,7 +415,7 @@
               </w:rPr>
             </w:pPr>
           </w:p>
-          <w:p>
+          <w:p ns2:paraId="001E9AFD" ns2:textId="77777777">
             <w:pPr>
               <w:pBdr>
                 <w:top w:val="nil"/>
@@ -463,7 +463,7 @@
               <w:t>_______Fecha________Firma___________</w:t>
             </w:r>
           </w:p>
-          <w:p>
+          <w:p ns2:paraId="312C7A55" ns2:textId="77777777">
             <w:pPr>
               <w:pBdr>
                 <w:top w:val="nil"/>
@@ -482,7 +482,7 @@
               </w:rPr>
             </w:pPr>
           </w:p>
-          <w:p>
+          <w:p ns2:paraId="125DDEFB" ns2:textId="77777777">
             <w:pPr>
               <w:pBdr>
                 <w:top w:val="nil"/>
@@ -505,7 +505,7 @@
         </w:tc>
       </w:tr>
     </w:tbl>
-    <w:p>
+    <w:p ns2:paraId="052CE5D4" ns2:textId="77777777">
       <w:pPr>
         <w:spacing w:after="0" w:line="240" w:lineRule="auto"/>
         <w:rPr>
@@ -516,7 +516,7 @@
         </w:rPr>
       </w:pPr>
     </w:p>
-    <w:p>
+    <w:p ns2:paraId="520E3EBA" ns2:textId="36DE31E5">
       <w:pPr>
         <w:spacing w:after="0" w:line="240" w:lineRule="auto"/>
         <w:rPr>
@@ -547,7 +547,7 @@
         <w:t xml:space="preserve"> EXAMEN EN FORMA PRESENCIAL DURANTE EL PROCESO DE SU EXAMEN EVITE PEDIR PRESTADO (PLUMAS, HOJAS, SACAPUNTAS, CORRECTOR, YA QUE SON DE USO PERSONAL). SI ES SORPRENDIDO COPIANDO EN CUALQUIERA DE SUS FORMAS (VOLTEANDO, CON EL CELULAR EN MANO, COMPARANDO, HABLANDO, CUADERNO ABIERTO, INTERCAMBIANDO EXÁMENES, ETC.) SE LE APLICARÁ EL RIENM ANUANDOSE EL EXAMEN Y NOTIFICANDO A JEFATURA CARRERA </w:t>
       </w:r>
     </w:p>
-    <w:p>
+    <w:p ns2:paraId="078937D8" ns2:textId="77777777">
       <w:pPr>
         <w:spacing w:line="200" w:lineRule="auto"/>
         <w:rPr>
@@ -617,8 +617,328 @@
           <w:szCs w:val="20"/>
         </w:rPr>
       </w:pPr>
+      <w:r>
+        <w:rPr>
+          <w:b/>
+          <w:bCs/>
+          <w:sz w:val="20"/>
+          <w:szCs w:val="20"/>
+        </w:rPr>
+        <w:t xml:space="preserve">ASIGNATURA: {materia}</w:t>
+      </w:r>
     </w:p>
     <w:p>
+      <w:pPr>
+        <w:spacing w:line="200" w:lineRule="auto"/>
+        <w:rPr>
+          <w:b/>
+          <w:bCs/>
+          <w:sz w:val="20"/>
+          <w:szCs w:val="20"/>
+        </w:rPr>
+      </w:pPr>
+      <w:r>
+        <w:rPr>
+          <w:b/>
+          <w:bCs/>
+          <w:sz w:val="20"/>
+          <w:szCs w:val="20"/>
+        </w:rPr>
+        <w:t xml:space="preserve"/>
+      </w:r>
+    </w:p>
+    <w:p>
+      <w:pPr>
+        <w:spacing w:line="200" w:lineRule="auto"/>
+        <w:rPr>
+          <w:b/>
+          <w:bCs/>
+          <w:sz w:val="20"/>
+          <w:szCs w:val="20"/>
+        </w:rPr>
+      </w:pPr>
+      <w:r>
+        <w:rPr>
+          <w:b/>
+          <w:bCs/>
+          <w:sz w:val="20"/>
+          <w:szCs w:val="20"/>
+        </w:rPr>
+        <w:t xml:space="preserve">TEMAS EVALUADOS:</w:t>
+      </w:r>
+    </w:p>
+    <w:p>
+      <w:pPr>
+        <w:spacing w:line="200" w:lineRule="auto"/>
+        <w:rPr>
+          <w:b/>
+          <w:bCs/>
+          <w:sz w:val="20"/>
+          <w:szCs w:val="20"/>
+        </w:rPr>
+      </w:pPr>
+      <w:r>
+        <w:rPr>
+          <w:b/>
+          <w:bCs/>
+          <w:sz w:val="20"/>
+          <w:szCs w:val="20"/>
+        </w:rPr>
+        <w:t xml:space="preserve">{temasEvaluar}</w:t>
+      </w:r>
+    </w:p>
+    <w:p>
+      <w:pPr>
+        <w:spacing w:line="200" w:lineRule="auto"/>
+        <w:rPr>
+          <w:b/>
+          <w:bCs/>
+          <w:sz w:val="20"/>
+          <w:szCs w:val="20"/>
+        </w:rPr>
+      </w:pPr>
+      <w:r>
+        <w:rPr>
+          <w:b/>
+          <w:bCs/>
+          <w:sz w:val="20"/>
+          <w:szCs w:val="20"/>
+        </w:rPr>
+        <w:t xml:space="preserve"/>
+      </w:r>
+    </w:p>
+    <w:p>
+      <w:pPr>
+        <w:spacing w:line="200" w:lineRule="auto"/>
+        <w:rPr>
+          <w:b/>
+          <w:bCs/>
+          <w:sz w:val="20"/>
+          <w:szCs w:val="20"/>
+        </w:rPr>
+      </w:pPr>
+      <w:r>
+        <w:rPr>
+          <w:b/>
+          <w:bCs/>
+          <w:sz w:val="20"/>
+          <w:szCs w:val="20"/>
+        </w:rPr>
+        <w:t xml:space="preserve">I. OPCIÓN MÚLTIPLE</w:t>
+      </w:r>
+    </w:p>
+    <w:p>
+      <w:pPr>
+        <w:spacing w:line="200" w:lineRule="auto"/>
+        <w:rPr>
+          <w:b/>
+          <w:bCs/>
+          <w:sz w:val="20"/>
+          <w:szCs w:val="20"/>
+        </w:rPr>
+      </w:pPr>
+      <w:r>
+        <w:rPr>
+          <w:b/>
+          <w:bCs/>
+          <w:sz w:val="20"/>
+          <w:szCs w:val="20"/>
+        </w:rPr>
+        <w:t xml:space="preserve">{opcionMultiple}</w:t>
+      </w:r>
+    </w:p>
+    <w:p>
+      <w:pPr>
+        <w:spacing w:line="200" w:lineRule="auto"/>
+        <w:rPr>
+          <w:b/>
+          <w:bCs/>
+          <w:sz w:val="20"/>
+          <w:szCs w:val="20"/>
+        </w:rPr>
+      </w:pPr>
+      <w:r>
+        <w:rPr>
+          <w:b/>
+          <w:bCs/>
+          <w:sz w:val="20"/>
+          <w:szCs w:val="20"/>
+        </w:rPr>
+        <w:t xml:space="preserve"/>
+      </w:r>
+    </w:p>
+    <w:p>
+      <w:pPr>
+        <w:spacing w:line="200" w:lineRule="auto"/>
+        <w:rPr>
+          <w:b/>
+          <w:bCs/>
+          <w:sz w:val="20"/>
+          <w:szCs w:val="20"/>
+        </w:rPr>
+      </w:pPr>
+      <w:r>
+        <w:rPr>
+          <w:b/>
+          <w:bCs/>
+          <w:sz w:val="20"/>
+          <w:szCs w:val="20"/>
+        </w:rPr>
+        <w:t xml:space="preserve">II. VERDADERO / FALSO</w:t>
+      </w:r>
+    </w:p>
+    <w:p>
+      <w:pPr>
+        <w:spacing w:line="200" w:lineRule="auto"/>
+        <w:rPr>
+          <w:b/>
+          <w:bCs/>
+          <w:sz w:val="20"/>
+          <w:szCs w:val="20"/>
+        </w:rPr>
+      </w:pPr>
+      <w:r>
+        <w:rPr>
+          <w:b/>
+          <w:bCs/>
+          <w:sz w:val="20"/>
+          <w:szCs w:val="20"/>
+        </w:rPr>
+        <w:t xml:space="preserve">{verdaderoFalso}</w:t>
+      </w:r>
+    </w:p>
+    <w:p>
+      <w:pPr>
+        <w:spacing w:line="200" w:lineRule="auto"/>
+        <w:rPr>
+          <w:b/>
+          <w:bCs/>
+          <w:sz w:val="20"/>
+          <w:szCs w:val="20"/>
+        </w:rPr>
+      </w:pPr>
+      <w:r>
+        <w:rPr>
+          <w:b/>
+          <w:bCs/>
+          <w:sz w:val="20"/>
+          <w:szCs w:val="20"/>
+        </w:rPr>
+        <w:t xml:space="preserve"/>
+      </w:r>
+    </w:p>
+    <w:p>
+      <w:pPr>
+        <w:spacing w:line="200" w:lineRule="auto"/>
+        <w:rPr>
+          <w:b/>
+          <w:bCs/>
+          <w:sz w:val="20"/>
+          <w:szCs w:val="20"/>
+        </w:rPr>
+      </w:pPr>
+      <w:r>
+        <w:rPr>
+          <w:b/>
+          <w:bCs/>
+          <w:sz w:val="20"/>
+          <w:szCs w:val="20"/>
+        </w:rPr>
+        <w:t xml:space="preserve">III. RELACIONAR COLUMNAS</w:t>
+      </w:r>
+    </w:p>
+    <w:p>
+      <w:pPr>
+        <w:spacing w:line="200" w:lineRule="auto"/>
+        <w:rPr>
+          <w:b/>
+          <w:bCs/>
+          <w:sz w:val="20"/>
+          <w:szCs w:val="20"/>
+        </w:rPr>
+      </w:pPr>
+      <w:r>
+        <w:rPr>
+          <w:b/>
+          <w:bCs/>
+          <w:sz w:val="20"/>
+          <w:szCs w:val="20"/>
+        </w:rPr>
+        <w:t xml:space="preserve">{relacionarColumnas}</w:t>
+      </w:r>
+    </w:p>
+    <w:p>
+      <w:pPr>
+        <w:spacing w:line="200" w:lineRule="auto"/>
+        <w:rPr>
+          <w:b/>
+          <w:bCs/>
+          <w:sz w:val="20"/>
+          <w:szCs w:val="20"/>
+        </w:rPr>
+      </w:pPr>
+      <w:r>
+        <w:rPr>
+          <w:b/>
+          <w:bCs/>
+          <w:sz w:val="20"/>
+          <w:szCs w:val="20"/>
+        </w:rPr>
+        <w:t xml:space="preserve"/>
+      </w:r>
+    </w:p>
+    <w:p>
+      <w:pPr>
+        <w:spacing w:line="200" w:lineRule="auto"/>
+        <w:rPr>
+          <w:b/>
+          <w:bCs/>
+          <w:sz w:val="20"/>
+          <w:szCs w:val="20"/>
+        </w:rPr>
+      </w:pPr>
+      <w:r>
+        <w:rPr>
+          <w:b/>
+          <w:bCs/>
+          <w:sz w:val="20"/>
+          <w:szCs w:val="20"/>
+        </w:rPr>
+        <w:t xml:space="preserve">IV. PREGUNTAS ABIERTAS</w:t>
+      </w:r>
+    </w:p>
+    <w:p>
+      <w:pPr>
+        <w:spacing w:line="200" w:lineRule="auto"/>
+        <w:rPr>
+          <w:b/>
+          <w:bCs/>
+          <w:sz w:val="20"/>
+          <w:szCs w:val="20"/>
+        </w:rPr>
+      </w:pPr>
+      <w:r>
+        <w:rPr>
+          <w:b/>
+          <w:bCs/>
+          <w:sz w:val="20"/>
+          <w:szCs w:val="20"/>
+        </w:rPr>
+        <w:t xml:space="preserve">{preguntasAbiertas}</w:t>
+      </w:r>
+    </w:p>
+    <w:p ns2:paraId="36301DE1" ns2:textId="77777777">
+      <w:pPr>
+        <w:spacing w:line="200" w:lineRule="auto"/>
+        <w:rPr>
+          <w:b/>
+          <w:bCs/>
+          <w:sz w:val="20"/>
+          <w:szCs w:val="20"/>
+        </w:rPr>
+      </w:pPr>
+    </w:p>
+    <w:p ns2:paraId="60F79C9E" ns2:textId="77777777">
       <w:pPr>
         <w:spacing w:line="200" w:lineRule="auto"/>
         <w:rPr>
@@ -631,7 +951,7 @@
       <w:bookmarkStart w:id="0" w:name="_heading=h.xs0wh0py1gab" w:colFirst="0" w:colLast="0"/>
       <w:bookmarkEnd w:id="0"/>
     </w:p>
-    <w:p>
+    <w:p ns2:paraId="16403A22" ns2:textId="77777777">
       <w:pPr>
         <w:spacing w:line="200" w:lineRule="auto"/>
         <w:rPr>
@@ -643,7 +963,7 @@
         </w:rPr>
       </w:pPr>
     </w:p>
-    <w:p>
+    <w:p ns2:paraId="3902F0EF" ns2:textId="77777777">
       <w:pPr>
         <w:rPr>
           <w:rFonts w:ascii="Arial" w:eastAsia="Arial" w:hAnsi="Arial" w:cs="Arial"/>
@@ -674,7 +994,7 @@
         <w:gridCol w:w="561"/>
         <w:gridCol w:w="5063"/>
       </w:tblGrid>
-      <w:tr>
+      <w:tr ns2:paraId="71A23BDE" ns2:textId="77777777">
         <w:tc>
           <w:tcPr>
             <w:tcW w:w="5007" w:type="dxa"/>
@@ -684,7 +1004,7 @@
               <w:right w:val="nil"/>
             </w:tcBorders>
           </w:tcPr>
-          <w:p>
+          <w:p ns2:paraId="40E1DEB6" ns2:textId="73BEC240">
             <w:pPr>
               <w:spacing w:after="0"/>
               <w:rPr>
@@ -705,7 +1025,7 @@
               <w:right w:val="nil"/>
             </w:tcBorders>
           </w:tcPr>
-          <w:p>
+          <w:p ns2:paraId="3429B672" ns2:textId="77777777">
             <w:pPr>
               <w:spacing w:after="0"/>
               <w:rPr>
@@ -725,7 +1045,7 @@
               <w:bottom w:val="single" w:sz="4" w:space="0" w:color="000000"/>
             </w:tcBorders>
           </w:tcPr>
-          <w:p>
+          <w:p ns2:paraId="3F491472" ns2:textId="77777777">
             <w:pPr>
               <w:spacing w:after="0"/>
               <w:rPr>
@@ -737,7 +1057,7 @@
           </w:p>
         </w:tc>
       </w:tr>
-      <w:tr>
+      <w:tr ns2:paraId="318956F6" ns2:textId="77777777">
         <w:tc>
           <w:tcPr>
             <w:tcW w:w="5007" w:type="dxa"/>
@@ -746,7 +1066,7 @@
               <w:right w:val="nil"/>
             </w:tcBorders>
           </w:tcPr>
-          <w:p>
+          <w:p ns2:paraId="77DFA769" ns2:textId="77777777">
             <w:pPr>
               <w:spacing w:after="0"/>
               <w:jc w:val="center"/>
@@ -776,7 +1096,7 @@
               <w:right w:val="nil"/>
             </w:tcBorders>
           </w:tcPr>
-          <w:p>
+          <w:p ns2:paraId="5A265969" ns2:textId="77777777">
             <w:pPr>
               <w:spacing w:after="0"/>
               <w:jc w:val="center"/>
@@ -796,7 +1116,7 @@
               <w:bottom w:val="nil"/>
             </w:tcBorders>
           </w:tcPr>
-          <w:p>
+          <w:p ns2:paraId="0C40EB23" ns2:textId="77777777">
             <w:pPr>
               <w:spacing w:after="0"/>
               <w:jc w:val="center"/>
@@ -818,7 +1138,7 @@
         </w:tc>
       </w:tr>
     </w:tbl>
-    <w:p>
+    <w:p ns2:paraId="7CD9EC83" ns2:textId="77777777">
       <w:pPr>
         <w:spacing w:after="0"/>
         <w:rPr>

</xml_diff>